<commit_message>
Reframe TGA proposal as submitted by the referral partner
Written from Mirza-Zain Baig's side as Referral Partner to TGA. Scope now
spells out marketing, in-person visits, full onboarding, point of contact
and file ownership. Setup fee tied to the onboarding work.

Co-Authored-By: Claude Fable 5.1 <noreply@anthropic.com>
Claude-Session: https://claude.ai/code/session_017bmpCHFofrZfjM3gLvxrRy
</commit_message>
<xml_diff>
--- a/proposals/TGA-Referral-Partnership-Proposal.docx
+++ b/proposals/TGA-Referral-Partnership-Proposal.docx
@@ -16,7 +16,7 @@
           <w:sz w:val="40"/>
           <w:szCs w:val="40"/>
         </w:rPr>
-        <w:t xml:space="preserve">TGA Referral Partnership Proposal</w:t>
+        <w:t xml:space="preserve">Referral Partnership Proposal</w:t>
       </w:r>
     </w:p>
     <w:p>
@@ -32,7 +32,7 @@
           <w:sz w:val="22"/>
           <w:szCs w:val="22"/>
         </w:rPr>
-        <w:t xml:space="preserve">Draft for discussion. Prepared September 2026.</w:t>
+        <w:t xml:space="preserve">Submitted to TGA by Mirza-Zain Baig, acting as Referral Partner.</w:t>
       </w:r>
     </w:p>
     <w:p>
@@ -48,7 +48,7 @@
           <w:sz w:val="22"/>
           <w:szCs w:val="22"/>
         </w:rPr>
-        <w:t xml:space="preserve">Between TGA (the Company) and [Partner Name] (the Referral Partner).</w:t>
+        <w:t xml:space="preserve">Draft for discussion. September 2026.</w:t>
       </w:r>
     </w:p>
     <w:p>
@@ -78,20 +78,20 @@
           <w:sz w:val="22"/>
           <w:szCs w:val="22"/>
         </w:rPr>
-        <w:t xml:space="preserve">There is a large number of Islamic and Quranic schools across the Greater Toronto Area that the Referral Partner, or a person the Referral Partner works with, knows personally, can reach directly, and has already built trust with. Most of these schools have no academic solution in place. They do not want to build and run a fully fledged academic school themselves. What they want is an academic program they can offset to a provider while they keep their focus on Quran and Islamic studies.</w:t>
-      </w:r>
-    </w:p>
-    <w:p>
-      <w:pPr>
-        <w:spacing w:after="160" w:line="300"/>
-      </w:pPr>
-      <w:r>
-        <w:rPr>
-          <w:rFonts w:ascii="Calibri" w:cs="Calibri" w:eastAsia="Calibri" w:hAnsi="Calibri"/>
-          <w:sz w:val="22"/>
-          <w:szCs w:val="22"/>
-        </w:rPr>
-        <w:t xml:space="preserve">TGA provides that academic program. This proposal sets out how the Referral Partner would bring these schools to TGA, what the Referral Partner would be responsible for, and how the Referral Partner would be compensated.</w:t>
+        <w:t xml:space="preserve">There is a large number of Islamic and Quranic schools across the Greater Toronto Area that I know personally, or that a partner of mine knows personally, where I can communicate directly and where trust is already built. Most of these schools have no academic solution in place. They do not want to build and run a fully fledged academic school themselves. What they want is an academic program they can offset to a provider while they keep their focus on Quran and Islamic studies.</w:t>
+      </w:r>
+    </w:p>
+    <w:p>
+      <w:pPr>
+        <w:spacing w:after="160" w:line="300"/>
+      </w:pPr>
+      <w:r>
+        <w:rPr>
+          <w:rFonts w:ascii="Calibri" w:cs="Calibri" w:eastAsia="Calibri" w:hAnsi="Calibri"/>
+          <w:sz w:val="22"/>
+          <w:szCs w:val="22"/>
+        </w:rPr>
+        <w:t xml:space="preserve">TGA provides that program. This proposal sets out how I would bring these schools to TGA as a Referral Partner, what I would take responsibility for, and the commercial terms I am proposing.</w:t>
       </w:r>
     </w:p>
     <w:p>
@@ -108,72 +108,98 @@
           <w:sz w:val="26"/>
           <w:szCs w:val="26"/>
         </w:rPr>
-        <w:t xml:space="preserve">2. Role of the Referral Partner</w:t>
-      </w:r>
-    </w:p>
-    <w:p>
-      <w:pPr>
-        <w:spacing w:after="160" w:line="300"/>
-      </w:pPr>
-      <w:r>
-        <w:rPr>
-          <w:rFonts w:ascii="Calibri" w:cs="Calibri" w:eastAsia="Calibri" w:hAnsi="Calibri"/>
-          <w:sz w:val="22"/>
-          <w:szCs w:val="22"/>
-        </w:rPr>
-        <w:t xml:space="preserve">The Referral Partner is the relationship owner for every school they bring in. This means three things.</w:t>
-      </w:r>
-    </w:p>
-    <w:p>
-      <w:pPr>
-        <w:spacing w:after="160" w:line="300"/>
-      </w:pPr>
-      <w:r>
-        <w:rPr>
-          <w:rFonts w:ascii="Calibri" w:cs="Calibri" w:eastAsia="Calibri" w:hAnsi="Calibri"/>
-          <w:sz w:val="22"/>
-          <w:szCs w:val="22"/>
-        </w:rPr>
-        <w:t xml:space="preserve">First, the Referral Partner creates the relationship. They identify the school, make the introduction, present TGA's program, and bring the school to the point of signing.</w:t>
-      </w:r>
-    </w:p>
-    <w:p>
-      <w:pPr>
-        <w:spacing w:after="160" w:line="300"/>
-      </w:pPr>
-      <w:r>
-        <w:rPr>
-          <w:rFonts w:ascii="Calibri" w:cs="Calibri" w:eastAsia="Calibri" w:hAnsi="Calibri"/>
-          <w:sz w:val="22"/>
-          <w:szCs w:val="22"/>
-        </w:rPr>
-        <w:t xml:space="preserve">Second, the Referral Partner is the school's point of contact. Day to day questions from the school's administration go to the Referral Partner first. The Referral Partner escalates to TGA anything that requires TGA to act.</w:t>
-      </w:r>
-    </w:p>
-    <w:p>
-      <w:pPr>
-        <w:spacing w:after="160" w:line="300"/>
-      </w:pPr>
-      <w:r>
-        <w:rPr>
-          <w:rFonts w:ascii="Calibri" w:cs="Calibri" w:eastAsia="Calibri" w:hAnsi="Calibri"/>
-          <w:sz w:val="22"/>
-          <w:szCs w:val="22"/>
-        </w:rPr>
-        <w:t xml:space="preserve">Third, the Referral Partner is responsible for the file. This includes keeping the school's enrolment numbers current with TGA each month, ensuring the school understands the pricing tier it sits in, supporting onboarding and renewals, and flagging early any risk that a school may reduce numbers or leave.</w:t>
-      </w:r>
-    </w:p>
-    <w:p>
-      <w:pPr>
-        <w:spacing w:after="160" w:line="300"/>
-      </w:pPr>
-      <w:r>
-        <w:rPr>
-          <w:rFonts w:ascii="Calibri" w:cs="Calibri" w:eastAsia="Calibri" w:hAnsi="Calibri"/>
-          <w:sz w:val="22"/>
-          <w:szCs w:val="22"/>
-        </w:rPr>
-        <w:t xml:space="preserve">TGA remains responsible for the delivery of the academic program itself, the platform, the teachers, the curriculum, student records, and the invoicing of the school at the agreed price.</w:t>
+        <w:t xml:space="preserve">2. Scope of My Role</w:t>
+      </w:r>
+    </w:p>
+    <w:p>
+      <w:pPr>
+        <w:spacing w:after="160" w:line="300"/>
+      </w:pPr>
+      <w:r>
+        <w:rPr>
+          <w:rFonts w:ascii="Calibri" w:cs="Calibri" w:eastAsia="Calibri" w:hAnsi="Calibri"/>
+          <w:sz w:val="22"/>
+          <w:szCs w:val="22"/>
+        </w:rPr>
+        <w:t xml:space="preserve">I would be the relationship owner for every school I bring to TGA. In practice this covers the full cycle from first contact to a running account.</w:t>
+      </w:r>
+    </w:p>
+    <w:p>
+      <w:pPr>
+        <w:spacing w:after="160" w:line="300"/>
+      </w:pPr>
+      <w:r>
+        <w:rPr>
+          <w:rFonts w:ascii="Calibri" w:cs="Calibri" w:eastAsia="Calibri" w:hAnsi="Calibri"/>
+          <w:sz w:val="22"/>
+          <w:szCs w:val="22"/>
+        </w:rPr>
+        <w:t xml:space="preserve">Marketing. I would market TGA's program to the schools in my network and in my partner's network, using material approved by TGA and presenting the program accurately.</w:t>
+      </w:r>
+    </w:p>
+    <w:p>
+      <w:pPr>
+        <w:spacing w:after="160" w:line="300"/>
+      </w:pPr>
+      <w:r>
+        <w:rPr>
+          <w:rFonts w:ascii="Calibri" w:cs="Calibri" w:eastAsia="Calibri" w:hAnsi="Calibri"/>
+          <w:sz w:val="22"/>
+          <w:szCs w:val="22"/>
+        </w:rPr>
+        <w:t xml:space="preserve">In-person visits. I would visit each school in person, meet the administration, walk them through the program, and bring them to the point of signing. These are relationships that are built face to face, not over email.</w:t>
+      </w:r>
+    </w:p>
+    <w:p>
+      <w:pPr>
+        <w:spacing w:after="160" w:line="300"/>
+      </w:pPr>
+      <w:r>
+        <w:rPr>
+          <w:rFonts w:ascii="Calibri" w:cs="Calibri" w:eastAsia="Calibri" w:hAnsi="Calibri"/>
+          <w:sz w:val="22"/>
+          <w:szCs w:val="22"/>
+        </w:rPr>
+        <w:t xml:space="preserve">Full onboarding. I would handle the onboarding of each school end to end, collecting the student list and enrolment details, setting up the school with TGA, coordinating the start date, and making sure the school's staff and parents understand how the program works.</w:t>
+      </w:r>
+    </w:p>
+    <w:p>
+      <w:pPr>
+        <w:spacing w:after="160" w:line="300"/>
+      </w:pPr>
+      <w:r>
+        <w:rPr>
+          <w:rFonts w:ascii="Calibri" w:cs="Calibri" w:eastAsia="Calibri" w:hAnsi="Calibri"/>
+          <w:sz w:val="22"/>
+          <w:szCs w:val="22"/>
+        </w:rPr>
+        <w:t xml:space="preserve">Point of contact. Once a school is live, day to day questions from the school's administration come to me first. I escalate to TGA anything that requires TGA to act.</w:t>
+      </w:r>
+    </w:p>
+    <w:p>
+      <w:pPr>
+        <w:spacing w:after="160" w:line="300"/>
+      </w:pPr>
+      <w:r>
+        <w:rPr>
+          <w:rFonts w:ascii="Calibri" w:cs="Calibri" w:eastAsia="Calibri" w:hAnsi="Calibri"/>
+          <w:sz w:val="22"/>
+          <w:szCs w:val="22"/>
+        </w:rPr>
+        <w:t xml:space="preserve">Responsibility for the file. I keep each school's enrolment numbers current with TGA every month, make sure the school knows which pricing tier it sits in, support renewals, and flag early any risk that a school may reduce numbers or leave.</w:t>
+      </w:r>
+    </w:p>
+    <w:p>
+      <w:pPr>
+        <w:spacing w:after="160" w:line="300"/>
+      </w:pPr>
+      <w:r>
+        <w:rPr>
+          <w:rFonts w:ascii="Calibri" w:cs="Calibri" w:eastAsia="Calibri" w:hAnsi="Calibri"/>
+          <w:sz w:val="22"/>
+          <w:szCs w:val="22"/>
+        </w:rPr>
+        <w:t xml:space="preserve">TGA remains responsible for the delivery of the academic program, the platform, the teachers, the curriculum, student records, and the invoicing of the school at the agreed price.</w:t>
       </w:r>
     </w:p>
     <w:p>
@@ -333,7 +359,7 @@
                 <w:sz w:val="20"/>
                 <w:szCs w:val="20"/>
               </w:rPr>
-              <w:t xml:space="preserve">Referral fee to the Partner (per student, per month)</w:t>
+              <w:t xml:space="preserve">My referral fee (per student, per month)</w:t>
             </w:r>
           </w:p>
         </w:tc>
@@ -1056,7 +1082,7 @@
           <w:sz w:val="22"/>
           <w:szCs w:val="22"/>
         </w:rPr>
-        <w:t xml:space="preserve">The listed price is the price the school pays. The Referral Partner does not sell above or below the listed price for the applicable tier without TGA's written agreement.</w:t>
+        <w:t xml:space="preserve">The listed price is the price the school pays. I would not sell above or below the listed price for the applicable tier without TGA's written agreement.</w:t>
       </w:r>
     </w:p>
     <w:p>
@@ -1082,7 +1108,7 @@
           <w:sz w:val="22"/>
           <w:szCs w:val="22"/>
         </w:rPr>
-        <w:t xml:space="preserve">As a worked example, a school with 30 students sits in Tier 3. TGA invoices the school $28,500 for the month. The Referral Partner receives $6,000. TGA retains $22,500.</w:t>
+        <w:t xml:space="preserve">As a worked example, a school with 30 students sits in Tier 3. TGA invoices the school $28,500 for the month. I receive $6,000. TGA retains $22,500.</w:t>
       </w:r>
     </w:p>
     <w:p>
@@ -1112,20 +1138,20 @@
           <w:sz w:val="22"/>
           <w:szCs w:val="22"/>
         </w:rPr>
-        <w:t xml:space="preserve">The Referral Partner may charge each school a one time setup fee for the onboarding work they perform. This fee is set by the Referral Partner, invoiced by the Referral Partner directly to the school, and collected by the Referral Partner. TGA is not a party to that fee and takes no share of it.</w:t>
-      </w:r>
-    </w:p>
-    <w:p>
-      <w:pPr>
-        <w:spacing w:after="160" w:line="300"/>
-      </w:pPr>
-      <w:r>
-        <w:rPr>
-          <w:rFonts w:ascii="Calibri" w:cs="Calibri" w:eastAsia="Calibri" w:hAnsi="Calibri"/>
-          <w:sz w:val="22"/>
-          <w:szCs w:val="22"/>
-        </w:rPr>
-        <w:t xml:space="preserve">This is recorded here for transparency only. The Referral Partner will make clear to each school, in writing, that the setup fee is the Referral Partner's own fee and is separate from TGA's monthly price.</w:t>
+        <w:t xml:space="preserve">For the in-person visits and the onboarding work described in section 2, I would charge each school a one time setup fee. This fee is set by me, invoiced by me directly to the school, and collected by me. TGA is not a party to that fee and takes no share of it.</w:t>
+      </w:r>
+    </w:p>
+    <w:p>
+      <w:pPr>
+        <w:spacing w:after="160" w:line="300"/>
+      </w:pPr>
+      <w:r>
+        <w:rPr>
+          <w:rFonts w:ascii="Calibri" w:cs="Calibri" w:eastAsia="Calibri" w:hAnsi="Calibri"/>
+          <w:sz w:val="22"/>
+          <w:szCs w:val="22"/>
+        </w:rPr>
+        <w:t xml:space="preserve">I am recording this here for full transparency. I would make clear to each school, in writing, that the setup fee is my own fee for onboarding and is separate from TGA's monthly price.</w:t>
       </w:r>
     </w:p>
     <w:p>
@@ -1155,33 +1181,33 @@
           <w:sz w:val="22"/>
           <w:szCs w:val="22"/>
         </w:rPr>
-        <w:t xml:space="preserve">The Referral Partner also has contacts among homeschooling families across Ontario. For these families the terms are flat and do not change with volume.</w:t>
-      </w:r>
-    </w:p>
-    <w:p>
-      <w:pPr>
-        <w:spacing w:after="160" w:line="300"/>
-      </w:pPr>
-      <w:r>
-        <w:rPr>
-          <w:rFonts w:ascii="Calibri" w:cs="Calibri" w:eastAsia="Calibri" w:hAnsi="Calibri"/>
-          <w:sz w:val="22"/>
-          <w:szCs w:val="22"/>
-        </w:rPr>
-        <w:t xml:space="preserve">The family is charged $1,000 per student, per month. The Referral Partner receives a referral fee of $50 per student, per month. There is no ceiling on the number of students and no tier change at any volume.</w:t>
-      </w:r>
-    </w:p>
-    <w:p>
-      <w:pPr>
-        <w:spacing w:after="160" w:line="300"/>
-      </w:pPr>
-      <w:r>
-        <w:rPr>
-          <w:rFonts w:ascii="Calibri" w:cs="Calibri" w:eastAsia="Calibri" w:hAnsi="Calibri"/>
-          <w:sz w:val="22"/>
-          <w:szCs w:val="22"/>
-        </w:rPr>
-        <w:t xml:space="preserve">Homeschool referrals are tracked through a referral code assigned to the Referral Partner and entered by the family on the TGA website at signup. Only enrolments carrying the Referral Partner's code are credited to the Referral Partner. The Referral Partner is not the point of contact for homeschool families in the way they are for schools, TGA handles those families directly, the Referral Partner's role is the introduction and the code.</w:t>
+        <w:t xml:space="preserve">I also have many contacts among homeschooling families across Ontario. For these families I am proposing flat terms that do not change with volume.</w:t>
+      </w:r>
+    </w:p>
+    <w:p>
+      <w:pPr>
+        <w:spacing w:after="160" w:line="300"/>
+      </w:pPr>
+      <w:r>
+        <w:rPr>
+          <w:rFonts w:ascii="Calibri" w:cs="Calibri" w:eastAsia="Calibri" w:hAnsi="Calibri"/>
+          <w:sz w:val="22"/>
+          <w:szCs w:val="22"/>
+        </w:rPr>
+        <w:t xml:space="preserve">The family is charged $1,000 per student, per month. I receive a referral fee of $50 per student, per month. There is no ceiling on the number of students and no tier change at any volume.</w:t>
+      </w:r>
+    </w:p>
+    <w:p>
+      <w:pPr>
+        <w:spacing w:after="160" w:line="300"/>
+      </w:pPr>
+      <w:r>
+        <w:rPr>
+          <w:rFonts w:ascii="Calibri" w:cs="Calibri" w:eastAsia="Calibri" w:hAnsi="Calibri"/>
+          <w:sz w:val="22"/>
+          <w:szCs w:val="22"/>
+        </w:rPr>
+        <w:t xml:space="preserve">Homeschool referrals would be tracked through a referral code assigned to me and entered by the family on the TGA website at signup. Every enrolment carrying my code is credited to me. For homeschool families my role is the introduction and the code, TGA handles those families directly.</w:t>
       </w:r>
     </w:p>
     <w:p>
@@ -1211,20 +1237,20 @@
           <w:sz w:val="22"/>
           <w:szCs w:val="22"/>
         </w:rPr>
-        <w:t xml:space="preserve">TGA invoices each school and each homeschool family directly. TGA pays the Referral Partner their referral fees once per month, within fifteen days of the end of the month, on all amounts collected in that month. Each payment comes with a statement listing every school and every homeschool student credited to the Referral Partner, the tier applied, the amount collected, and the fee calculated.</w:t>
-      </w:r>
-    </w:p>
-    <w:p>
-      <w:pPr>
-        <w:spacing w:after="160" w:line="300"/>
-      </w:pPr>
-      <w:r>
-        <w:rPr>
-          <w:rFonts w:ascii="Calibri" w:cs="Calibri" w:eastAsia="Calibri" w:hAnsi="Calibri"/>
-          <w:sz w:val="22"/>
-          <w:szCs w:val="22"/>
-        </w:rPr>
-        <w:t xml:space="preserve">The Referral Partner invoices TGA for the amount shown on the statement. The Referral Partner is responsible for their own taxes and for registering and charging HST where required.</w:t>
+        <w:t xml:space="preserve">TGA invoices each school and each homeschool family directly. TGA pays my referral fees once per month, within fifteen days of the end of the month, on all amounts collected in that month. Each payment comes with a statement listing every school and every homeschool student credited to me, the tier applied, the amount collected, and the fee calculated.</w:t>
+      </w:r>
+    </w:p>
+    <w:p>
+      <w:pPr>
+        <w:spacing w:after="160" w:line="300"/>
+      </w:pPr>
+      <w:r>
+        <w:rPr>
+          <w:rFonts w:ascii="Calibri" w:cs="Calibri" w:eastAsia="Calibri" w:hAnsi="Calibri"/>
+          <w:sz w:val="22"/>
+          <w:szCs w:val="22"/>
+        </w:rPr>
+        <w:t xml:space="preserve">I invoice TGA for the amount shown on the statement and I am responsible for my own taxes, including HST where applicable.</w:t>
       </w:r>
     </w:p>
     <w:p>
@@ -1254,33 +1280,33 @@
           <w:sz w:val="22"/>
           <w:szCs w:val="22"/>
         </w:rPr>
-        <w:t xml:space="preserve">This partnership runs for an initial term of twelve months from signature and renews automatically for further twelve month periods unless either side gives sixty days written notice.</w:t>
-      </w:r>
-    </w:p>
-    <w:p>
-      <w:pPr>
-        <w:spacing w:after="160" w:line="300"/>
-      </w:pPr>
-      <w:r>
-        <w:rPr>
-          <w:rFonts w:ascii="Calibri" w:cs="Calibri" w:eastAsia="Calibri" w:hAnsi="Calibri"/>
-          <w:sz w:val="22"/>
-          <w:szCs w:val="22"/>
-        </w:rPr>
-        <w:t xml:space="preserve">The partnership is non exclusive on both sides. TGA may work with other referral partners and may sell directly. The Referral Partner may represent other products, provided they do not represent a competing academic program to the same schools while this agreement is in force.</w:t>
-      </w:r>
-    </w:p>
-    <w:p>
-      <w:pPr>
-        <w:spacing w:after="160" w:line="300"/>
-      </w:pPr>
-      <w:r>
-        <w:rPr>
-          <w:rFonts w:ascii="Calibri" w:cs="Calibri" w:eastAsia="Calibri" w:hAnsi="Calibri"/>
-          <w:sz w:val="22"/>
-          <w:szCs w:val="22"/>
-        </w:rPr>
-        <w:t xml:space="preserve">A school introduced by the Referral Partner is credited to the Referral Partner for as long as that school remains an active TGA client and the Referral Partner remains its point of contact. If the partnership ends, TGA continues to pay referral fees on schools already signed for a further twelve months from the date of termination, after which the accounts pass fully to TGA. Homeschool referral fees follow the same twelve month tail.</w:t>
+        <w:t xml:space="preserve">I am proposing an initial term of twelve months from signature, renewing automatically for further twelve month periods unless either side gives sixty days written notice.</w:t>
+      </w:r>
+    </w:p>
+    <w:p>
+      <w:pPr>
+        <w:spacing w:after="160" w:line="300"/>
+      </w:pPr>
+      <w:r>
+        <w:rPr>
+          <w:rFonts w:ascii="Calibri" w:cs="Calibri" w:eastAsia="Calibri" w:hAnsi="Calibri"/>
+          <w:sz w:val="22"/>
+          <w:szCs w:val="22"/>
+        </w:rPr>
+        <w:t xml:space="preserve">The partnership would be non exclusive on both sides. TGA may work with other referral partners and may sell directly. I may represent other products, provided I do not represent a competing academic program to the same schools while this agreement is in force.</w:t>
+      </w:r>
+    </w:p>
+    <w:p>
+      <w:pPr>
+        <w:spacing w:after="160" w:line="300"/>
+      </w:pPr>
+      <w:r>
+        <w:rPr>
+          <w:rFonts w:ascii="Calibri" w:cs="Calibri" w:eastAsia="Calibri" w:hAnsi="Calibri"/>
+          <w:sz w:val="22"/>
+          <w:szCs w:val="22"/>
+        </w:rPr>
+        <w:t xml:space="preserve">A school I introduce is credited to me for as long as that school remains an active TGA client. If the partnership ends, TGA continues to pay referral fees on schools already signed for a further twelve months from the date of termination, after which the accounts pass fully to TGA. Homeschool referral fees follow the same twelve month tail.</w:t>
       </w:r>
     </w:p>
     <w:p>
@@ -1323,46 +1349,33 @@
           <w:sz w:val="22"/>
           <w:szCs w:val="22"/>
         </w:rPr>
-        <w:t xml:space="preserve">The Referral Partner represents TGA accurately. They do not make promises about the program, the curriculum, results, or accreditation beyond what TGA has provided in writing. All marketing material carrying the TGA name is approved by TGA before use.</w:t>
-      </w:r>
-    </w:p>
-    <w:p>
-      <w:pPr>
-        <w:spacing w:after="160" w:line="300"/>
-      </w:pPr>
-      <w:r>
-        <w:rPr>
-          <w:rFonts w:ascii="Calibri" w:cs="Calibri" w:eastAsia="Calibri" w:hAnsi="Calibri"/>
-          <w:sz w:val="22"/>
-          <w:szCs w:val="22"/>
-        </w:rPr>
-        <w:t xml:space="preserve">The Referral Partner keeps confidential all information about TGA's pricing, students, schools, and operations, and does not share it beyond what is needed to serve the schools in their portfolio.</w:t>
-      </w:r>
-    </w:p>
-    <w:p>
-      <w:pPr>
-        <w:spacing w:after="160" w:line="300"/>
-      </w:pPr>
-      <w:r>
-        <w:rPr>
-          <w:rFonts w:ascii="Calibri" w:cs="Calibri" w:eastAsia="Calibri" w:hAnsi="Calibri"/>
-          <w:sz w:val="22"/>
-          <w:szCs w:val="22"/>
-        </w:rPr>
-        <w:t xml:space="preserve">The Referral Partner does not offer any inducement, discount, or side arrangement to a school or family that is not written into this agreement.</w:t>
-      </w:r>
-    </w:p>
-    <w:p>
-      <w:pPr>
-        <w:spacing w:after="160" w:line="300"/>
-      </w:pPr>
-      <w:r>
-        <w:rPr>
-          <w:rFonts w:ascii="Calibri" w:cs="Calibri" w:eastAsia="Calibri" w:hAnsi="Calibri"/>
-          <w:sz w:val="22"/>
-          <w:szCs w:val="22"/>
-        </w:rPr>
-        <w:t xml:space="preserve">Referral fees are earned on genuine third party enrolments. No referral fee is payable on students enrolled by an institution the Referral Partner owns or controls unless TGA agrees to it in writing in advance.</w:t>
+        <w:t xml:space="preserve">I would represent TGA accurately and would not make promises about the program, the curriculum, results, or accreditation beyond what TGA has provided in writing. Any marketing material carrying the TGA name would be approved by TGA before use.</w:t>
+      </w:r>
+    </w:p>
+    <w:p>
+      <w:pPr>
+        <w:spacing w:after="160" w:line="300"/>
+      </w:pPr>
+      <w:r>
+        <w:rPr>
+          <w:rFonts w:ascii="Calibri" w:cs="Calibri" w:eastAsia="Calibri" w:hAnsi="Calibri"/>
+          <w:sz w:val="22"/>
+          <w:szCs w:val="22"/>
+        </w:rPr>
+        <w:t xml:space="preserve">I would keep confidential all information about TGA's pricing, students, schools, and operations, and would not share it beyond what is needed to serve the schools in my portfolio.</w:t>
+      </w:r>
+    </w:p>
+    <w:p>
+      <w:pPr>
+        <w:spacing w:after="160" w:line="300"/>
+      </w:pPr>
+      <w:r>
+        <w:rPr>
+          <w:rFonts w:ascii="Calibri" w:cs="Calibri" w:eastAsia="Calibri" w:hAnsi="Calibri"/>
+          <w:sz w:val="22"/>
+          <w:szCs w:val="22"/>
+        </w:rPr>
+        <w:t xml:space="preserve">I would not offer any inducement, discount, or side arrangement to a school or family that is not written into this agreement.</w:t>
       </w:r>
     </w:p>
     <w:p>
@@ -1392,7 +1405,7 @@
           <w:sz w:val="22"/>
           <w:szCs w:val="22"/>
         </w:rPr>
-        <w:t xml:space="preserve">The Referral Partner provides TGA with a short monthly update on their pipeline, listing schools in discussion, expected student numbers, and expected start dates. TGA provides the Referral Partner with the monthly fee statement described in section 6 and access to enrolment figures for the schools in their portfolio.</w:t>
+        <w:t xml:space="preserve">I would provide TGA with a short monthly update on my pipeline, listing schools in discussion, expected student numbers, and expected start dates. TGA would provide me with the monthly fee statement described in section 6 and access to enrolment figures for the schools in my portfolio.</w:t>
       </w:r>
     </w:p>
     <w:p>
@@ -1422,20 +1435,20 @@
           <w:sz w:val="22"/>
           <w:szCs w:val="22"/>
         </w:rPr>
-        <w:t xml:space="preserve">If these terms are acceptable in principle, the next step is a short call to confirm the points marked below, after which TGA will prepare the formal referral agreement for signature.</w:t>
-      </w:r>
-    </w:p>
-    <w:p>
-      <w:pPr>
-        <w:spacing w:after="160" w:line="300"/>
-      </w:pPr>
-      <w:r>
-        <w:rPr>
-          <w:rFonts w:ascii="Calibri" w:cs="Calibri" w:eastAsia="Calibri" w:hAnsi="Calibri"/>
-          <w:sz w:val="22"/>
-          <w:szCs w:val="22"/>
-        </w:rPr>
-        <w:t xml:space="preserve">Points to confirm before the formal agreement is drafted: the exact legal name and entity of the Referral Partner, whether the Referral Partner will operate under a personal name or a company, the referral code to be assigned, the target list of schools for the first ninety days, and the launch date.</w:t>
+        <w:t xml:space="preserve">If these terms are acceptable in principle, I propose a short call to confirm the open points, after which the formal referral agreement can be prepared for signature.</w:t>
+      </w:r>
+    </w:p>
+    <w:p>
+      <w:pPr>
+        <w:spacing w:after="160" w:line="300"/>
+      </w:pPr>
+      <w:r>
+        <w:rPr>
+          <w:rFonts w:ascii="Calibri" w:cs="Calibri" w:eastAsia="Calibri" w:hAnsi="Calibri"/>
+          <w:sz w:val="22"/>
+          <w:szCs w:val="22"/>
+        </w:rPr>
+        <w:t xml:space="preserve">Points to confirm before the formal agreement is drafted: the referral code to be assigned to me, the onboarding process and materials TGA will provide, the target list of schools for the first ninety days, and the launch date.</w:t>
       </w:r>
     </w:p>
     <w:p>
@@ -1454,7 +1467,7 @@
           <w:sz w:val="18"/>
           <w:szCs w:val="18"/>
         </w:rPr>
-        <w:t xml:space="preserve">Prepared by TGA. This document is a draft proposal for discussion and does not create a binding agreement. Terms are subject to the formal referral agreement to be signed by both parties.</w:t>
+        <w:t xml:space="preserve">Submitted by Mirza-Zain Baig, Referral Partner. This document is a draft proposal for discussion and does not create a binding agreement. Terms are subject to the formal referral agreement to be signed by both parties.</w:t>
       </w:r>
     </w:p>
     <w:sectPr>

</xml_diff>

<commit_message>
Drop term clause, base referral fees on paid invoices
Section 7 on term and exclusivity removed and later sections renumbered.
Payment section now ties fees to invoices actually paid by the school,
with yearly and bi-annual prepayments paid out in the month collected.

Co-Authored-By: Claude Fable 5.1 <noreply@anthropic.com>
Claude-Session: https://claude.ai/code/session_017bmpCHFofrZfjM3gLvxrRy
</commit_message>
<xml_diff>
--- a/proposals/TGA-Referral-Partnership-Proposal.docx
+++ b/proposals/TGA-Referral-Partnership-Proposal.docx
@@ -1237,20 +1237,46 @@
           <w:sz w:val="22"/>
           <w:szCs w:val="22"/>
         </w:rPr>
-        <w:t xml:space="preserve">TGA invoices each school and each homeschool family directly. TGA pays my referral fees once per month, within fifteen days of the end of the month, on all amounts collected in that month. Each payment comes with a statement listing every school and every homeschool student credited to me, the tier applied, the amount collected, and the fee calculated.</w:t>
-      </w:r>
-    </w:p>
-    <w:p>
-      <w:pPr>
-        <w:spacing w:after="160" w:line="300"/>
-      </w:pPr>
-      <w:r>
-        <w:rPr>
-          <w:rFonts w:ascii="Calibri" w:cs="Calibri" w:eastAsia="Calibri" w:hAnsi="Calibri"/>
-          <w:sz w:val="22"/>
-          <w:szCs w:val="22"/>
-        </w:rPr>
-        <w:t xml:space="preserve">I invoice TGA for the amount shown on the statement and I am responsible for my own taxes, including HST where applicable.</w:t>
+        <w:t xml:space="preserve">TGA invoices each school and each homeschool family directly. My referral fee is earned only on invoices the school or family has actually paid to TGA. No fee is payable on an invoice that is unpaid, refunded, or waived, and if an invoice is paid late the fee on it is paid in the cycle after TGA receives the money.</w:t>
+      </w:r>
+    </w:p>
+    <w:p>
+      <w:pPr>
+        <w:spacing w:after="160" w:line="300"/>
+      </w:pPr>
+      <w:r>
+        <w:rPr>
+          <w:rFonts w:ascii="Calibri" w:cs="Calibri" w:eastAsia="Calibri" w:hAnsi="Calibri"/>
+          <w:sz w:val="22"/>
+          <w:szCs w:val="22"/>
+        </w:rPr>
+        <w:t xml:space="preserve">Where a school pays monthly, TGA pays my referral fee once per month, within fifteen days of the end of the month, on all invoices paid in that month.</w:t>
+      </w:r>
+    </w:p>
+    <w:p>
+      <w:pPr>
+        <w:spacing w:after="160" w:line="300"/>
+      </w:pPr>
+      <w:r>
+        <w:rPr>
+          <w:rFonts w:ascii="Calibri" w:cs="Calibri" w:eastAsia="Calibri" w:hAnsi="Calibri"/>
+          <w:sz w:val="22"/>
+          <w:szCs w:val="22"/>
+        </w:rPr>
+        <w:t xml:space="preserve">Where a school pays yearly or bi-annually in advance, my referral fee on the full amount of that paid invoice is paid in the same way, within fifteen days of the end of the month in which TGA received the payment, rather than being spread over the months the payment covers. The fee is calculated at the tier the school sits in on the invoice date, applied to the number of students and months the invoice covers. If the school later withdraws students and TGA refunds part of that invoice, the fee on the refunded portion is deducted from my next payment.</w:t>
+      </w:r>
+    </w:p>
+    <w:p>
+      <w:pPr>
+        <w:spacing w:after="160" w:line="300"/>
+      </w:pPr>
+      <w:r>
+        <w:rPr>
+          <w:rFonts w:ascii="Calibri" w:cs="Calibri" w:eastAsia="Calibri" w:hAnsi="Calibri"/>
+          <w:sz w:val="22"/>
+          <w:szCs w:val="22"/>
+        </w:rPr>
+        <w:t xml:space="preserve">Each payment comes with a statement listing every school and every homeschool student credited to me, the tier applied, the invoices paid, and the fee calculated. I invoice TGA for the amount shown on the statement and I am responsible for my own taxes, including HST where applicable.</w:t>
       </w:r>
     </w:p>
     <w:p>
@@ -1267,59 +1293,46 @@
           <w:sz w:val="26"/>
           <w:szCs w:val="26"/>
         </w:rPr>
-        <w:t xml:space="preserve">7. Term, Exclusivity, and Ending the Partnership</w:t>
-      </w:r>
-    </w:p>
-    <w:p>
-      <w:pPr>
-        <w:spacing w:after="160" w:line="300"/>
-      </w:pPr>
-      <w:r>
-        <w:rPr>
-          <w:rFonts w:ascii="Calibri" w:cs="Calibri" w:eastAsia="Calibri" w:hAnsi="Calibri"/>
-          <w:sz w:val="22"/>
-          <w:szCs w:val="22"/>
-        </w:rPr>
-        <w:t xml:space="preserve">I am proposing an initial term of twelve months from signature, renewing automatically for further twelve month periods unless either side gives sixty days written notice.</w:t>
-      </w:r>
-    </w:p>
-    <w:p>
-      <w:pPr>
-        <w:spacing w:after="160" w:line="300"/>
-      </w:pPr>
-      <w:r>
-        <w:rPr>
-          <w:rFonts w:ascii="Calibri" w:cs="Calibri" w:eastAsia="Calibri" w:hAnsi="Calibri"/>
-          <w:sz w:val="22"/>
-          <w:szCs w:val="22"/>
-        </w:rPr>
-        <w:t xml:space="preserve">The partnership would be non exclusive on both sides. TGA may work with other referral partners and may sell directly. I may represent other products, provided I do not represent a competing academic program to the same schools while this agreement is in force.</w:t>
-      </w:r>
-    </w:p>
-    <w:p>
-      <w:pPr>
-        <w:spacing w:after="160" w:line="300"/>
-      </w:pPr>
-      <w:r>
-        <w:rPr>
-          <w:rFonts w:ascii="Calibri" w:cs="Calibri" w:eastAsia="Calibri" w:hAnsi="Calibri"/>
-          <w:sz w:val="22"/>
-          <w:szCs w:val="22"/>
-        </w:rPr>
-        <w:t xml:space="preserve">A school I introduce is credited to me for as long as that school remains an active TGA client. If the partnership ends, TGA continues to pay referral fees on schools already signed for a further twelve months from the date of termination, after which the accounts pass fully to TGA. Homeschool referral fees follow the same twelve month tail.</w:t>
-      </w:r>
-    </w:p>
-    <w:p>
-      <w:pPr>
-        <w:spacing w:after="160" w:line="300"/>
-      </w:pPr>
-      <w:r>
-        <w:rPr>
-          <w:rFonts w:ascii="Calibri" w:cs="Calibri" w:eastAsia="Calibri" w:hAnsi="Calibri"/>
-          <w:sz w:val="22"/>
-          <w:szCs w:val="22"/>
-        </w:rPr>
-        <w:t xml:space="preserve">Either side may end the agreement immediately in writing if the other side materially breaches it and does not correct the breach within thirty days of being notified.</w:t>
+        <w:t xml:space="preserve">7. Conduct and Standards</w:t>
+      </w:r>
+    </w:p>
+    <w:p>
+      <w:pPr>
+        <w:spacing w:after="160" w:line="300"/>
+      </w:pPr>
+      <w:r>
+        <w:rPr>
+          <w:rFonts w:ascii="Calibri" w:cs="Calibri" w:eastAsia="Calibri" w:hAnsi="Calibri"/>
+          <w:sz w:val="22"/>
+          <w:szCs w:val="22"/>
+        </w:rPr>
+        <w:t xml:space="preserve">I would represent TGA accurately and would not make promises about the program, the curriculum, results, or accreditation beyond what TGA has provided in writing. Any marketing material carrying the TGA name would be approved by TGA before use.</w:t>
+      </w:r>
+    </w:p>
+    <w:p>
+      <w:pPr>
+        <w:spacing w:after="160" w:line="300"/>
+      </w:pPr>
+      <w:r>
+        <w:rPr>
+          <w:rFonts w:ascii="Calibri" w:cs="Calibri" w:eastAsia="Calibri" w:hAnsi="Calibri"/>
+          <w:sz w:val="22"/>
+          <w:szCs w:val="22"/>
+        </w:rPr>
+        <w:t xml:space="preserve">I would keep confidential all information about TGA's pricing, students, schools, and operations, and would not share it beyond what is needed to serve the schools in my portfolio.</w:t>
+      </w:r>
+    </w:p>
+    <w:p>
+      <w:pPr>
+        <w:spacing w:after="160" w:line="300"/>
+      </w:pPr>
+      <w:r>
+        <w:rPr>
+          <w:rFonts w:ascii="Calibri" w:cs="Calibri" w:eastAsia="Calibri" w:hAnsi="Calibri"/>
+          <w:sz w:val="22"/>
+          <w:szCs w:val="22"/>
+        </w:rPr>
+        <w:t xml:space="preserve">I would not offer any inducement, discount, or side arrangement to a school or family that is not written into this agreement.</w:t>
       </w:r>
     </w:p>
     <w:p>
@@ -1336,46 +1349,20 @@
           <w:sz w:val="26"/>
           <w:szCs w:val="26"/>
         </w:rPr>
-        <w:t xml:space="preserve">8. Conduct and Standards</w:t>
-      </w:r>
-    </w:p>
-    <w:p>
-      <w:pPr>
-        <w:spacing w:after="160" w:line="300"/>
-      </w:pPr>
-      <w:r>
-        <w:rPr>
-          <w:rFonts w:ascii="Calibri" w:cs="Calibri" w:eastAsia="Calibri" w:hAnsi="Calibri"/>
-          <w:sz w:val="22"/>
-          <w:szCs w:val="22"/>
-        </w:rPr>
-        <w:t xml:space="preserve">I would represent TGA accurately and would not make promises about the program, the curriculum, results, or accreditation beyond what TGA has provided in writing. Any marketing material carrying the TGA name would be approved by TGA before use.</w:t>
-      </w:r>
-    </w:p>
-    <w:p>
-      <w:pPr>
-        <w:spacing w:after="160" w:line="300"/>
-      </w:pPr>
-      <w:r>
-        <w:rPr>
-          <w:rFonts w:ascii="Calibri" w:cs="Calibri" w:eastAsia="Calibri" w:hAnsi="Calibri"/>
-          <w:sz w:val="22"/>
-          <w:szCs w:val="22"/>
-        </w:rPr>
-        <w:t xml:space="preserve">I would keep confidential all information about TGA's pricing, students, schools, and operations, and would not share it beyond what is needed to serve the schools in my portfolio.</w:t>
-      </w:r>
-    </w:p>
-    <w:p>
-      <w:pPr>
-        <w:spacing w:after="160" w:line="300"/>
-      </w:pPr>
-      <w:r>
-        <w:rPr>
-          <w:rFonts w:ascii="Calibri" w:cs="Calibri" w:eastAsia="Calibri" w:hAnsi="Calibri"/>
-          <w:sz w:val="22"/>
-          <w:szCs w:val="22"/>
-        </w:rPr>
-        <w:t xml:space="preserve">I would not offer any inducement, discount, or side arrangement to a school or family that is not written into this agreement.</w:t>
+        <w:t xml:space="preserve">8. Reporting</w:t>
+      </w:r>
+    </w:p>
+    <w:p>
+      <w:pPr>
+        <w:spacing w:after="160" w:line="300"/>
+      </w:pPr>
+      <w:r>
+        <w:rPr>
+          <w:rFonts w:ascii="Calibri" w:cs="Calibri" w:eastAsia="Calibri" w:hAnsi="Calibri"/>
+          <w:sz w:val="22"/>
+          <w:szCs w:val="22"/>
+        </w:rPr>
+        <w:t xml:space="preserve">I would provide TGA with a short monthly update on my pipeline, listing schools in discussion, expected student numbers, and expected start dates. TGA would provide me with the monthly fee statement described in section 6 and access to enrolment figures for the schools in my portfolio.</w:t>
       </w:r>
     </w:p>
     <w:p>
@@ -1392,37 +1379,7 @@
           <w:sz w:val="26"/>
           <w:szCs w:val="26"/>
         </w:rPr>
-        <w:t xml:space="preserve">9. Reporting</w:t>
-      </w:r>
-    </w:p>
-    <w:p>
-      <w:pPr>
-        <w:spacing w:after="160" w:line="300"/>
-      </w:pPr>
-      <w:r>
-        <w:rPr>
-          <w:rFonts w:ascii="Calibri" w:cs="Calibri" w:eastAsia="Calibri" w:hAnsi="Calibri"/>
-          <w:sz w:val="22"/>
-          <w:szCs w:val="22"/>
-        </w:rPr>
-        <w:t xml:space="preserve">I would provide TGA with a short monthly update on my pipeline, listing schools in discussion, expected student numbers, and expected start dates. TGA would provide me with the monthly fee statement described in section 6 and access to enrolment figures for the schools in my portfolio.</w:t>
-      </w:r>
-    </w:p>
-    <w:p>
-      <w:pPr>
-        <w:pStyle w:val="Heading1"/>
-        <w:spacing w:after="120" w:before="280"/>
-      </w:pPr>
-      <w:r>
-        <w:rPr>
-          <w:rFonts w:ascii="Calibri" w:cs="Calibri" w:eastAsia="Calibri" w:hAnsi="Calibri"/>
-          <w:b/>
-          <w:bCs/>
-          <w:color w:val="1F3A5F"/>
-          <w:sz w:val="26"/>
-          <w:szCs w:val="26"/>
-        </w:rPr>
-        <w:t xml:space="preserve">10. Next Steps</w:t>
+        <w:t xml:space="preserve">9. Next Steps</w:t>
       </w:r>
     </w:p>
     <w:p>

</xml_diff>

<commit_message>
Make all pricing and referral fees one time per student
Table, homeschool terms and worked example now read as one time per
student amounts. Payment section pays the fee on each paid invoice, split
to match annual or bi-annual instalments.

Co-Authored-By: Claude Fable 5.1 <noreply@anthropic.com>
Claude-Session: https://claude.ai/code/session_017bmpCHFofrZfjM3gLvxrRy
</commit_message>
<xml_diff>
--- a/proposals/TGA-Referral-Partnership-Proposal.docx
+++ b/proposals/TGA-Referral-Partnership-Proposal.docx
@@ -186,7 +186,7 @@
           <w:sz w:val="22"/>
           <w:szCs w:val="22"/>
         </w:rPr>
-        <w:t xml:space="preserve">Responsibility for the file. I keep each school's enrolment numbers current with TGA every month, make sure the school knows which pricing tier it sits in, support renewals, and flag early any risk that a school may reduce numbers or leave.</w:t>
+        <w:t xml:space="preserve">Responsibility for the file. I keep each school's enrolment numbers current with TGA, make sure the school knows which pricing tier it sits in, support re-enrolments, and flag early any risk that a school may reduce numbers or leave.</w:t>
       </w:r>
     </w:p>
     <w:p>
@@ -229,7 +229,7 @@
           <w:sz w:val="22"/>
           <w:szCs w:val="22"/>
         </w:rPr>
-        <w:t xml:space="preserve">All prices below are per student, per month. The tier a school sits in is determined by the number of active enrolled students at that school on the first day of each billing month. The whole school is priced at its tier, the pricing is not marginal.</w:t>
+        <w:t xml:space="preserve">All prices and fees below are one time amounts, per student. They are not monthly. The tier a school sits in is determined by the total number of students the school has enrolled with TGA at the time the invoice is issued, including any students added after the initial enrolment. The whole school is priced at its tier, the pricing is not marginal.</w:t>
       </w:r>
     </w:p>
     <w:tbl>
@@ -332,7 +332,7 @@
                 <w:sz w:val="20"/>
                 <w:szCs w:val="20"/>
               </w:rPr>
-              <w:t xml:space="preserve">Price to the school (per student, per month)</w:t>
+              <w:t xml:space="preserve">Price to the school (per student, one time)</w:t>
             </w:r>
           </w:p>
         </w:tc>
@@ -359,7 +359,7 @@
                 <w:sz w:val="20"/>
                 <w:szCs w:val="20"/>
               </w:rPr>
-              <w:t xml:space="preserve">My referral fee (per student, per month)</w:t>
+              <w:t xml:space="preserve">My referral fee (per student, one time)</w:t>
             </w:r>
           </w:p>
         </w:tc>
@@ -386,7 +386,7 @@
                 <w:sz w:val="20"/>
                 <w:szCs w:val="20"/>
               </w:rPr>
-              <w:t xml:space="preserve">Net to TGA (per student, per month)</w:t>
+              <w:t xml:space="preserve">Net to TGA (per student, one time)</w:t>
             </w:r>
           </w:p>
         </w:tc>
@@ -1095,20 +1095,20 @@
           <w:sz w:val="22"/>
           <w:szCs w:val="22"/>
         </w:rPr>
-        <w:t xml:space="preserve">The referral fee is calculated on students TGA has actually invoiced and collected for that month. No referral fee is payable on a month that is refunded, waived, or unpaid. If a payment is later recovered, the referral fee on it is paid in the following cycle.</w:t>
-      </w:r>
-    </w:p>
-    <w:p>
-      <w:pPr>
-        <w:spacing w:after="160" w:line="300"/>
-      </w:pPr>
-      <w:r>
-        <w:rPr>
-          <w:rFonts w:ascii="Calibri" w:cs="Calibri" w:eastAsia="Calibri" w:hAnsi="Calibri"/>
-          <w:sz w:val="22"/>
-          <w:szCs w:val="22"/>
-        </w:rPr>
-        <w:t xml:space="preserve">As a worked example, a school with 30 students sits in Tier 3. TGA invoices the school $28,500 for the month. I receive $6,000. TGA retains $22,500.</w:t>
+        <w:t xml:space="preserve">The referral fee is earned once per enrolled student, on the amount the school has actually paid to TGA for that student. A student who re-enrols for a later period is treated as a new enrolment and carries the same price and referral fee.</w:t>
+      </w:r>
+    </w:p>
+    <w:p>
+      <w:pPr>
+        <w:spacing w:after="160" w:line="300"/>
+      </w:pPr>
+      <w:r>
+        <w:rPr>
+          <w:rFonts w:ascii="Calibri" w:cs="Calibri" w:eastAsia="Calibri" w:hAnsi="Calibri"/>
+          <w:sz w:val="22"/>
+          <w:szCs w:val="22"/>
+        </w:rPr>
+        <w:t xml:space="preserve">As a worked example, a school enrolling 30 students sits in Tier 3. TGA invoices the school $28,500. I receive $6,000. TGA retains $22,500.</w:t>
       </w:r>
     </w:p>
     <w:p>
@@ -1151,7 +1151,7 @@
           <w:sz w:val="22"/>
           <w:szCs w:val="22"/>
         </w:rPr>
-        <w:t xml:space="preserve">I am recording this here for full transparency. I would make clear to each school, in writing, that the setup fee is my own fee for onboarding and is separate from TGA's monthly price.</w:t>
+        <w:t xml:space="preserve">I am recording this here for full transparency. I would make clear to each school, in writing, that the setup fee is my own fee for onboarding and is separate from TGA's per student price.</w:t>
       </w:r>
     </w:p>
     <w:p>
@@ -1194,7 +1194,7 @@
           <w:sz w:val="22"/>
           <w:szCs w:val="22"/>
         </w:rPr>
-        <w:t xml:space="preserve">The family is charged $1,000 per student, per month. I receive a referral fee of $50 per student, per month. There is no ceiling on the number of students and no tier change at any volume.</w:t>
+        <w:t xml:space="preserve">The family is charged $1,000 per student, one time. I receive a referral fee of $50 per student, one time. There is no ceiling on the number of students and no tier change at any volume.</w:t>
       </w:r>
     </w:p>
     <w:p>
@@ -1237,33 +1237,33 @@
           <w:sz w:val="22"/>
           <w:szCs w:val="22"/>
         </w:rPr>
-        <w:t xml:space="preserve">TGA invoices each school and each homeschool family directly. My referral fee is earned only on invoices the school or family has actually paid to TGA. No fee is payable on an invoice that is unpaid, refunded, or waived, and if an invoice is paid late the fee on it is paid in the cycle after TGA receives the money.</w:t>
-      </w:r>
-    </w:p>
-    <w:p>
-      <w:pPr>
-        <w:spacing w:after="160" w:line="300"/>
-      </w:pPr>
-      <w:r>
-        <w:rPr>
-          <w:rFonts w:ascii="Calibri" w:cs="Calibri" w:eastAsia="Calibri" w:hAnsi="Calibri"/>
-          <w:sz w:val="22"/>
-          <w:szCs w:val="22"/>
-        </w:rPr>
-        <w:t xml:space="preserve">Where a school pays monthly, TGA pays my referral fee once per month, within fifteen days of the end of the month, on all invoices paid in that month.</w:t>
-      </w:r>
-    </w:p>
-    <w:p>
-      <w:pPr>
-        <w:spacing w:after="160" w:line="300"/>
-      </w:pPr>
-      <w:r>
-        <w:rPr>
-          <w:rFonts w:ascii="Calibri" w:cs="Calibri" w:eastAsia="Calibri" w:hAnsi="Calibri"/>
-          <w:sz w:val="22"/>
-          <w:szCs w:val="22"/>
-        </w:rPr>
-        <w:t xml:space="preserve">Where a school pays yearly or bi-annually in advance, my referral fee on the full amount of that paid invoice is paid in the same way, within fifteen days of the end of the month in which TGA received the payment, rather than being spread over the months the payment covers. The fee is calculated at the tier the school sits in on the invoice date, applied to the number of students and months the invoice covers. If the school later withdraws students and TGA refunds part of that invoice, the fee on the refunded portion is deducted from my next payment.</w:t>
+        <w:t xml:space="preserve">TGA invoices each school and each homeschool family directly. My referral fee is earned only on invoices the school or family has actually paid to TGA. No fee is payable on an invoice that is unpaid, refunded, or waived.</w:t>
+      </w:r>
+    </w:p>
+    <w:p>
+      <w:pPr>
+        <w:spacing w:after="160" w:line="300"/>
+      </w:pPr>
+      <w:r>
+        <w:rPr>
+          <w:rFonts w:ascii="Calibri" w:cs="Calibri" w:eastAsia="Calibri" w:hAnsi="Calibri"/>
+          <w:sz w:val="22"/>
+          <w:szCs w:val="22"/>
+        </w:rPr>
+        <w:t xml:space="preserve">TGA pays my referral fee within fifteen days of the end of the month in which TGA received the school's payment. Where a school pays its per student fee in full, my full referral fee on those students is paid in that cycle.</w:t>
+      </w:r>
+    </w:p>
+    <w:p>
+      <w:pPr>
+        <w:spacing w:after="160" w:line="300"/>
+      </w:pPr>
+      <w:r>
+        <w:rPr>
+          <w:rFonts w:ascii="Calibri" w:cs="Calibri" w:eastAsia="Calibri" w:hAnsi="Calibri"/>
+          <w:sz w:val="22"/>
+          <w:szCs w:val="22"/>
+        </w:rPr>
+        <w:t xml:space="preserve">Where a school pays yearly or bi-annually, meaning the per student fee is settled in one annual payment or in two half payments, my referral fee follows the same split. On an annual payment the full fee is paid in the cycle after TGA receives it. On bi-annual payments, half of my fee is paid in the cycle after TGA receives the first instalment and the other half in the cycle after TGA receives the second. If a school withdraws students and TGA refunds part of a paid invoice, the fee on the refunded portion is deducted from my next payment.</w:t>
       </w:r>
     </w:p>
     <w:p>
@@ -1362,7 +1362,7 @@
           <w:sz w:val="22"/>
           <w:szCs w:val="22"/>
         </w:rPr>
-        <w:t xml:space="preserve">I would provide TGA with a short monthly update on my pipeline, listing schools in discussion, expected student numbers, and expected start dates. TGA would provide me with the monthly fee statement described in section 6 and access to enrolment figures for the schools in my portfolio.</w:t>
+        <w:t xml:space="preserve">I would provide TGA with a short monthly update on my pipeline, listing schools in discussion, expected student numbers, and expected start dates. TGA would provide me with the fee statement described in section 6 and access to enrolment figures for the schools in my portfolio.</w:t>
       </w:r>
     </w:p>
     <w:p>

</xml_diff>